<commit_message>
Apply user edits: update content pages, remove unused files
Co-Authored-By: Claude Sonnet 4.6 <noreply@anthropic.com>
</commit_message>
<xml_diff>
--- a/doc/Dingjin Chu_CV_Updating.docx
+++ b/doc/Dingjin Chu_CV_Updating.docx
@@ -3681,6 +3681,29 @@
           <w:lang w:eastAsia="zh-CN"/>
         </w:rPr>
         <w:t>2024 National Olympic Sports Cup Adult Swimming Qualification Competition (8th)</w:t>
+      </w:r>
+    </w:p>
+    <w:p>
+      <w:pPr>
+        <w:spacing w:line="300" w:lineRule="auto"/>
+        <w:rPr>
+          <w:rFonts w:ascii="Times New Roman" w:eastAsia="DengXian" w:hAnsi="Times New Roman" w:cs="Times New Roman"/>
+          <w:lang w:eastAsia="zh-CN"/>
+        </w:rPr>
+      </w:pPr>
+      <w:r>
+        <w:rPr>
+          <w:rFonts w:ascii="Times New Roman" w:eastAsia="DengXian" w:hAnsi="Times New Roman" w:cs="Times New Roman"/>
+          <w:lang w:eastAsia="zh-CN"/>
+        </w:rPr>
+        <w:t xml:space="preserve">2026 </w:t>
+      </w:r>
+      <w:r>
+        <w:rPr>
+          <w:rFonts w:ascii="Times New Roman" w:eastAsia="DengXian" w:hAnsi="Times New Roman" w:cs="Times New Roman"/>
+          <w:lang w:eastAsia="zh-CN"/>
+        </w:rPr>
+        <w:t>Afanasiev Distinguished Graduate Fellowship Award</w:t>
       </w:r>
     </w:p>
     <w:p>
@@ -6504,7 +6527,6 @@
   <w:style w:type="character" w:default="1" w:styleId="DefaultParagraphFont">
     <w:name w:val="Default Paragraph Font"/>
     <w:uiPriority w:val="1"/>
-    <w:semiHidden/>
     <w:unhideWhenUsed/>
   </w:style>
   <w:style w:type="table" w:default="1" w:styleId="TableNormal">

</xml_diff>

<commit_message>
CV: add Oct 2026 Walk in the Forest volunteering at Martin Park Nature Center
Also repackage the .docx with standard forward-slash zip paths.

Co-Authored-By: Claude Opus 5.5 <noreply@anthropic.com>
</commit_message>
<xml_diff>
--- a/doc/Dingjin Chu_CV_Updating.docx
+++ b/doc/Dingjin Chu_CV_Updating.docx
@@ -1,76 +1,5 @@
 
-<file path=customXml\item1.xml><?xml version="1.0" encoding="utf-8"?>
-<b:Sources xmlns:b="http://schemas.openxmlformats.org/officeDocument/2006/bibliography" xmlns="http://schemas.openxmlformats.org/officeDocument/2006/bibliography" SelectedStyle="\APASixthEditionOfficeOnline.xsl" StyleName="APA" Version="6"/>
-</file>
-
-<file path=customXml\itemProps1.xml><?xml version="1.0" encoding="utf-8"?>
-<ds:datastoreItem xmlns:ds="http://schemas.openxmlformats.org/officeDocument/2006/customXml" ds:itemID="{840D81B6-2FB1-4541-A0EF-DBDDBF1D146C}">
-  <ds:schemaRefs>
-    <ds:schemaRef ds:uri="http://schemas.openxmlformats.org/officeDocument/2006/bibliography"/>
-  </ds:schemaRefs>
-</ds:datastoreItem>
-</file>
-
-<file path=docProps\app.xml><?xml version="1.0" encoding="utf-8"?>
-<Properties xmlns="http://schemas.openxmlformats.org/officeDocument/2006/extended-properties" xmlns:vt="http://schemas.openxmlformats.org/officeDocument/2006/docPropsVTypes">
-  <Template>Normal.dotm</Template>
-  <TotalTime>525</TotalTime>
-  <Pages>5</Pages>
-  <Words>1116</Words>
-  <Characters>6366</Characters>
-  <Application>Microsoft Office Word</Application>
-  <DocSecurity>0</DocSecurity>
-  <Lines>53</Lines>
-  <Paragraphs>14</Paragraphs>
-  <ScaleCrop>false</ScaleCrop>
-  <HeadingPairs>
-    <vt:vector size="2" baseType="variant">
-      <vt:variant>
-        <vt:lpstr>Title</vt:lpstr>
-      </vt:variant>
-      <vt:variant>
-        <vt:i4>1</vt:i4>
-      </vt:variant>
-    </vt:vector>
-  </HeadingPairs>
-  <TitlesOfParts>
-    <vt:vector size="1" baseType="lpstr">
-      <vt:lpstr/>
-    </vt:vector>
-  </TitlesOfParts>
-  <Company/>
-  <LinksUpToDate>false</LinksUpToDate>
-  <CharactersWithSpaces>7468</CharactersWithSpaces>
-  <SharedDoc>false</SharedDoc>
-  <HyperlinksChanged>false</HyperlinksChanged>
-  <AppVersion>16.0000</AppVersion>
-</Properties>
-</file>
-
-<file path=docProps\core.xml><?xml version="1.0" encoding="utf-8"?>
-<cp:coreProperties xmlns:cp="http://schemas.openxmlformats.org/package/2006/metadata/core-properties" xmlns:dc="http://purl.org/dc/elements/1.1/" xmlns:dcterms="http://purl.org/dc/terms/" xmlns:dcmitype="http://purl.org/dc/dcmitype/" xmlns:xsi="http://www.w3.org/2001/XMLSchema-instance">
-  <dc:title/>
-  <dc:subject/>
-  <dc:creator>Kari Diehl</dc:creator>
-  <cp:keywords/>
-  <dc:description/>
-  <cp:lastModifiedBy>Chu, Dingjin Chu</cp:lastModifiedBy>
-  <cp:revision>210</cp:revision>
-  <cp:lastPrinted>2026-02-22T16:52:00Z</cp:lastPrinted>
-  <dcterms:created xsi:type="dcterms:W3CDTF">2024-10-27T03:43:00Z</dcterms:created>
-  <dcterms:modified xsi:type="dcterms:W3CDTF">2026-08-26T18:23:00Z</dcterms:modified>
-</cp:coreProperties>
-</file>
-
-<file path=docProps\custom.xml><?xml version="1.0" encoding="utf-8"?>
-<Properties xmlns="http://schemas.openxmlformats.org/officeDocument/2006/custom-properties" xmlns:vt="http://schemas.openxmlformats.org/officeDocument/2006/docPropsVTypes">
-  <property fmtid="{D5CDD505-2E9C-101B-9397-08002B2CF9AE}" pid="2" name="GrammarlyDocumentId">
-    <vt:lpwstr>67fb35760f1fd382398e758901c04faa51c58e7ccf604de9de6111a6e6554e0c</vt:lpwstr>
-  </property>
-</Properties>
-</file>
-
-<file path=word\document.xml><?xml version="1.0" encoding="utf-8"?>
+<file path=word/document.xml><?xml version="1.0" encoding="utf-8"?>
 <w:document xmlns:wpc="http://schemas.microsoft.com/office/word/2010/wordprocessingCanvas" xmlns:cx="http://schemas.microsoft.com/office/drawing/2014/chartex" xmlns:cx1="http://schemas.microsoft.com/office/drawing/2015/9/8/chartex" xmlns:cx2="http://schemas.microsoft.com/office/drawing/2015/10/21/chartex" xmlns:cx3="http://schemas.microsoft.com/office/drawing/2016/5/9/chartex" xmlns:cx4="http://schemas.microsoft.com/office/drawing/2016/5/10/chartex" xmlns:cx5="http://schemas.microsoft.com/office/drawing/2016/5/11/chartex" xmlns:cx6="http://schemas.microsoft.com/office/drawing/2016/5/12/chartex" xmlns:cx7="http://schemas.microsoft.com/office/drawing/2016/5/13/chartex" xmlns:cx8="http://schemas.microsoft.com/office/drawing/2016/5/14/chartex" xmlns:mc="http://schemas.openxmlformats.org/markup-compatibility/2006" xmlns:aink="http://schemas.microsoft.com/office/drawing/2016/ink" xmlns:am3d="http://schemas.microsoft.com/office/drawing/2017/model3d" xmlns:o="urn:schemas-microsoft-com:office:office" xmlns:oel="http://schemas.microsoft.com/office/2019/extlst" xmlns:r="http://schemas.openxmlformats.org/officeDocument/2006/relationships" xmlns:m="http://schemas.openxmlformats.org/officeDocument/2006/math" xmlns:v="urn:schemas-microsoft-com:vml" xmlns:wp14="http://schemas.microsoft.com/office/word/2010/wordprocessingDrawing" xmlns:wp="http://schemas.openxmlformats.org/drawingml/2006/wordprocessingDrawing" xmlns:w10="urn:schemas-microsoft-com:office:word" xmlns:w="http://schemas.openxmlformats.org/wordprocessingml/2006/main" xmlns:w14="http://schemas.microsoft.com/office/word/2010/wordml" xmlns:w15="http://schemas.microsoft.com/office/word/2012/wordml" xmlns:w16cex="http://schemas.microsoft.com/office/word/2018/wordml/cex" xmlns:w16cid="http://schemas.microsoft.com/office/word/2016/wordml/cid" xmlns:w16="http://schemas.microsoft.com/office/word/2018/wordml" xmlns:w16du="http://schemas.microsoft.com/office/word/2023/wordml/word16du" xmlns:w16sdtdh="http://schemas.microsoft.com/office/word/2020/wordml/sdtdatahash" xmlns:w16sdtfl="http://schemas.microsoft.com/office/word/2024/wordml/sdtformatlock" xmlns:w16se="http://schemas.microsoft.com/office/word/2015/wordml/symex" xmlns:wpg="http://schemas.microsoft.com/office/word/2010/wordprocessingGroup" xmlns:wpi="http://schemas.microsoft.com/office/word/2010/wordprocessingInk" xmlns:wne="http://schemas.microsoft.com/office/word/2006/wordml" xmlns:wps="http://schemas.microsoft.com/office/word/2010/wordprocessingShape" mc:Ignorable="w14 w15 w16se w16cid w16 w16cex w16sdtdh w16sdtfl w16du wp14">
   <w:body>
     <w:p>
@@ -2752,6 +2681,22 @@
           <w:lang w:eastAsia="zh-CN"/>
         </w:rPr>
       </w:pPr>
+    </w:p>
+    <w:p>
+      <w:pPr>
+        <w:spacing w:line="240" w:lineRule="auto"/>
+        <w:rPr>
+          <w:rFonts w:eastAsia="DengXian"/>
+          <w:lang w:eastAsia="zh-CN"/>
+        </w:rPr>
+      </w:pPr>
+      <w:r>
+        <w:rPr>
+          <w:rFonts w:eastAsia="DengXian"/>
+          <w:lang w:eastAsia="zh-CN"/>
+        </w:rPr>
+        <w:t xml:space="preserve">10/2026 - Volunteer in the Walk in the Forest activity at Martin Park Nature Center, Oklahoma City, to share forestry knowledge with local visitors</w:t>
+      </w:r>
     </w:p>
     <w:p>
       <w:pPr>
@@ -4615,7 +4560,7 @@
 </w:document>
 </file>
 
-<file path=word\endnotes.xml><?xml version="1.0" encoding="utf-8"?>
+<file path=word/endnotes.xml><?xml version="1.0" encoding="utf-8"?>
 <w:endnotes xmlns:wpc="http://schemas.microsoft.com/office/word/2010/wordprocessingCanvas" xmlns:cx="http://schemas.microsoft.com/office/drawing/2014/chartex" xmlns:cx1="http://schemas.microsoft.com/office/drawing/2015/9/8/chartex" xmlns:cx2="http://schemas.microsoft.com/office/drawing/2015/10/21/chartex" xmlns:cx3="http://schemas.microsoft.com/office/drawing/2016/5/9/chartex" xmlns:cx4="http://schemas.microsoft.com/office/drawing/2016/5/10/chartex" xmlns:cx5="http://schemas.microsoft.com/office/drawing/2016/5/11/chartex" xmlns:cx6="http://schemas.microsoft.com/office/drawing/2016/5/12/chartex" xmlns:cx7="http://schemas.microsoft.com/office/drawing/2016/5/13/chartex" xmlns:cx8="http://schemas.microsoft.com/office/drawing/2016/5/14/chartex" xmlns:mc="http://schemas.openxmlformats.org/markup-compatibility/2006" xmlns:aink="http://schemas.microsoft.com/office/drawing/2016/ink" xmlns:am3d="http://schemas.microsoft.com/office/drawing/2017/model3d" xmlns:o="urn:schemas-microsoft-com:office:office" xmlns:oel="http://schemas.microsoft.com/office/2019/extlst" xmlns:r="http://schemas.openxmlformats.org/officeDocument/2006/relationships" xmlns:m="http://schemas.openxmlformats.org/officeDocument/2006/math" xmlns:v="urn:schemas-microsoft-com:vml" xmlns:wp14="http://schemas.microsoft.com/office/word/2010/wordprocessingDrawing" xmlns:wp="http://schemas.openxmlformats.org/drawingml/2006/wordprocessingDrawing" xmlns:w10="urn:schemas-microsoft-com:office:word" xmlns:w="http://schemas.openxmlformats.org/wordprocessingml/2006/main" xmlns:w14="http://schemas.microsoft.com/office/word/2010/wordml" xmlns:w15="http://schemas.microsoft.com/office/word/2012/wordml" xmlns:w16cex="http://schemas.microsoft.com/office/word/2018/wordml/cex" xmlns:w16cid="http://schemas.microsoft.com/office/word/2016/wordml/cid" xmlns:w16="http://schemas.microsoft.com/office/word/2018/wordml" xmlns:w16du="http://schemas.microsoft.com/office/word/2023/wordml/word16du" xmlns:w16sdtdh="http://schemas.microsoft.com/office/word/2020/wordml/sdtdatahash" xmlns:w16sdtfl="http://schemas.microsoft.com/office/word/2024/wordml/sdtformatlock" xmlns:w16se="http://schemas.microsoft.com/office/word/2015/wordml/symex" xmlns:wpg="http://schemas.microsoft.com/office/word/2010/wordprocessingGroup" xmlns:wpi="http://schemas.microsoft.com/office/word/2010/wordprocessingInk" xmlns:wne="http://schemas.microsoft.com/office/word/2006/wordml" xmlns:wps="http://schemas.microsoft.com/office/word/2010/wordprocessingShape" mc:Ignorable="w14 w15 w16se w16cid w16 w16cex w16sdtdh w16sdtfl w16du wp14">
   <w:endnote w:type="separator" w:id="-1">
     <w:p>
@@ -4640,91 +4585,7 @@
 </w:endnotes>
 </file>
 
-<file path=word\fontTable.xml><?xml version="1.0" encoding="utf-8"?>
-<w:fonts xmlns:mc="http://schemas.openxmlformats.org/markup-compatibility/2006" xmlns:r="http://schemas.openxmlformats.org/officeDocument/2006/relationships" xmlns:w="http://schemas.openxmlformats.org/wordprocessingml/2006/main" xmlns:w14="http://schemas.microsoft.com/office/word/2010/wordml" xmlns:w15="http://schemas.microsoft.com/office/word/2012/wordml" xmlns:w16cex="http://schemas.microsoft.com/office/word/2018/wordml/cex" xmlns:w16cid="http://schemas.microsoft.com/office/word/2016/wordml/cid" xmlns:w16="http://schemas.microsoft.com/office/word/2018/wordml" xmlns:w16du="http://schemas.microsoft.com/office/word/2023/wordml/word16du" xmlns:w16sdtdh="http://schemas.microsoft.com/office/word/2020/wordml/sdtdatahash" xmlns:w16sdtfl="http://schemas.microsoft.com/office/word/2024/wordml/sdtformatlock" xmlns:w16se="http://schemas.microsoft.com/office/word/2015/wordml/symex" mc:Ignorable="w14 w15 w16se w16cid w16 w16cex w16sdtdh w16sdtfl w16du">
-  <w:font w:name="Times New Roman">
-    <w:panose1 w:val="02020603050405020304"/>
-    <w:charset w:val="00"/>
-    <w:family w:val="roman"/>
-    <w:pitch w:val="variable"/>
-    <w:sig w:usb0="E0002EFF" w:usb1="C000785B" w:usb2="00000009" w:usb3="00000000" w:csb0="000001FF" w:csb1="00000000"/>
-  </w:font>
-  <w:font w:name="Symbol">
-    <w:panose1 w:val="05050102010706020507"/>
-    <w:charset w:val="02"/>
-    <w:family w:val="roman"/>
-    <w:pitch w:val="variable"/>
-    <w:sig w:usb0="00000000" w:usb1="10000000" w:usb2="00000000" w:usb3="00000000" w:csb0="80000000" w:csb1="00000000"/>
-  </w:font>
-  <w:font w:name="Courier New">
-    <w:panose1 w:val="02070309020205020404"/>
-    <w:charset w:val="00"/>
-    <w:family w:val="modern"/>
-    <w:pitch w:val="fixed"/>
-    <w:sig w:usb0="E0002EFF" w:usb1="C0007843" w:usb2="00000009" w:usb3="00000000" w:csb0="000001FF" w:csb1="00000000"/>
-  </w:font>
-  <w:font w:name="Wingdings">
-    <w:panose1 w:val="05000000000000000000"/>
-    <w:charset w:val="02"/>
-    <w:family w:val="auto"/>
-    <w:pitch w:val="variable"/>
-    <w:sig w:usb0="00000000" w:usb1="10000000" w:usb2="00000000" w:usb3="00000000" w:csb0="80000000" w:csb1="00000000"/>
-  </w:font>
-  <w:font w:name="Calibri">
-    <w:panose1 w:val="020F0502020204030204"/>
-    <w:charset w:val="00"/>
-    <w:family w:val="swiss"/>
-    <w:pitch w:val="variable"/>
-    <w:sig w:usb0="E4002EFF" w:usb1="C200247B" w:usb2="00000009" w:usb3="00000000" w:csb0="000001FF" w:csb1="00000000"/>
-  </w:font>
-  <w:font w:name="DengXian">
-    <w:altName w:val="等线"/>
-    <w:panose1 w:val="02010600030101010101"/>
-    <w:charset w:val="86"/>
-    <w:family w:val="auto"/>
-    <w:pitch w:val="variable"/>
-    <w:sig w:usb0="A00002BF" w:usb1="38CF7CFA" w:usb2="00000016" w:usb3="00000000" w:csb0="0004000F" w:csb1="00000000"/>
-  </w:font>
-  <w:font w:name="Arial">
-    <w:panose1 w:val="020B0604020202020204"/>
-    <w:charset w:val="00"/>
-    <w:family w:val="swiss"/>
-    <w:pitch w:val="variable"/>
-    <w:sig w:usb0="E0002EFF" w:usb1="C000785B" w:usb2="00000009" w:usb3="00000000" w:csb0="000001FF" w:csb1="00000000"/>
-  </w:font>
-  <w:font w:name="Roboto">
-    <w:charset w:val="00"/>
-    <w:family w:val="auto"/>
-    <w:pitch w:val="variable"/>
-    <w:sig w:usb0="E0000AFF" w:usb1="5000217F" w:usb2="00000021" w:usb3="00000000" w:csb0="0000019F" w:csb1="00000000"/>
-  </w:font>
-  <w:font w:name="Calibri Light">
-    <w:panose1 w:val="020F0302020204030204"/>
-    <w:charset w:val="00"/>
-    <w:family w:val="swiss"/>
-    <w:pitch w:val="variable"/>
-    <w:sig w:usb0="E4002EFF" w:usb1="C200247B" w:usb2="00000009" w:usb3="00000000" w:csb0="000001FF" w:csb1="00000000"/>
-  </w:font>
-  <w:font w:name="DengXian Light">
-    <w:altName w:val="等线 Light"/>
-    <w:panose1 w:val="02010600030101010101"/>
-    <w:charset w:val="86"/>
-    <w:family w:val="auto"/>
-    <w:pitch w:val="variable"/>
-    <w:sig w:usb0="A00002BF" w:usb1="38CF7CFA" w:usb2="00000016" w:usb3="00000000" w:csb0="0004000F" w:csb1="00000000"/>
-  </w:font>
-  <w:font w:name="SimSun">
-    <w:altName w:val="宋体"/>
-    <w:panose1 w:val="02010600030101010101"/>
-    <w:charset w:val="86"/>
-    <w:family w:val="auto"/>
-    <w:pitch w:val="variable"/>
-    <w:sig w:usb0="00000203" w:usb1="288F0000" w:usb2="00000016" w:usb3="00000000" w:csb0="00040001" w:csb1="00000000"/>
-  </w:font>
-</w:fonts>
-</file>
-
-<file path=word\footnotes.xml><?xml version="1.0" encoding="utf-8"?>
+<file path=word/footnotes.xml><?xml version="1.0" encoding="utf-8"?>
 <w:footnotes xmlns:wpc="http://schemas.microsoft.com/office/word/2010/wordprocessingCanvas" xmlns:cx="http://schemas.microsoft.com/office/drawing/2014/chartex" xmlns:cx1="http://schemas.microsoft.com/office/drawing/2015/9/8/chartex" xmlns:cx2="http://schemas.microsoft.com/office/drawing/2015/10/21/chartex" xmlns:cx3="http://schemas.microsoft.com/office/drawing/2016/5/9/chartex" xmlns:cx4="http://schemas.microsoft.com/office/drawing/2016/5/10/chartex" xmlns:cx5="http://schemas.microsoft.com/office/drawing/2016/5/11/chartex" xmlns:cx6="http://schemas.microsoft.com/office/drawing/2016/5/12/chartex" xmlns:cx7="http://schemas.microsoft.com/office/drawing/2016/5/13/chartex" xmlns:cx8="http://schemas.microsoft.com/office/drawing/2016/5/14/chartex" xmlns:mc="http://schemas.openxmlformats.org/markup-compatibility/2006" xmlns:aink="http://schemas.microsoft.com/office/drawing/2016/ink" xmlns:am3d="http://schemas.microsoft.com/office/drawing/2017/model3d" xmlns:o="urn:schemas-microsoft-com:office:office" xmlns:oel="http://schemas.microsoft.com/office/2019/extlst" xmlns:r="http://schemas.openxmlformats.org/officeDocument/2006/relationships" xmlns:m="http://schemas.openxmlformats.org/officeDocument/2006/math" xmlns:v="urn:schemas-microsoft-com:vml" xmlns:wp14="http://schemas.microsoft.com/office/word/2010/wordprocessingDrawing" xmlns:wp="http://schemas.openxmlformats.org/drawingml/2006/wordprocessingDrawing" xmlns:w10="urn:schemas-microsoft-com:office:word" xmlns:w="http://schemas.openxmlformats.org/wordprocessingml/2006/main" xmlns:w14="http://schemas.microsoft.com/office/word/2010/wordml" xmlns:w15="http://schemas.microsoft.com/office/word/2012/wordml" xmlns:w16cex="http://schemas.microsoft.com/office/word/2018/wordml/cex" xmlns:w16cid="http://schemas.microsoft.com/office/word/2016/wordml/cid" xmlns:w16="http://schemas.microsoft.com/office/word/2018/wordml" xmlns:w16du="http://schemas.microsoft.com/office/word/2023/wordml/word16du" xmlns:w16sdtdh="http://schemas.microsoft.com/office/word/2020/wordml/sdtdatahash" xmlns:w16sdtfl="http://schemas.microsoft.com/office/word/2024/wordml/sdtformatlock" xmlns:w16se="http://schemas.microsoft.com/office/word/2015/wordml/symex" xmlns:wpg="http://schemas.microsoft.com/office/word/2010/wordprocessingGroup" xmlns:wpi="http://schemas.microsoft.com/office/word/2010/wordprocessingInk" xmlns:wne="http://schemas.microsoft.com/office/word/2006/wordml" xmlns:wps="http://schemas.microsoft.com/office/word/2010/wordprocessingShape" mc:Ignorable="w14 w15 w16se w16cid w16 w16cex w16sdtdh w16sdtfl w16du wp14">
   <w:footnote w:type="separator" w:id="-1">
     <w:p>
@@ -4749,7 +4610,7 @@
 </w:footnotes>
 </file>
 
-<file path=word\numbering.xml><?xml version="1.0" encoding="utf-8"?>
+<file path=word/numbering.xml><?xml version="1.0" encoding="utf-8"?>
 <w:numbering xmlns:wpc="http://schemas.microsoft.com/office/word/2010/wordprocessingCanvas" xmlns:cx="http://schemas.microsoft.com/office/drawing/2014/chartex" xmlns:cx1="http://schemas.microsoft.com/office/drawing/2015/9/8/chartex" xmlns:cx2="http://schemas.microsoft.com/office/drawing/2015/10/21/chartex" xmlns:cx3="http://schemas.microsoft.com/office/drawing/2016/5/9/chartex" xmlns:cx4="http://schemas.microsoft.com/office/drawing/2016/5/10/chartex" xmlns:cx5="http://schemas.microsoft.com/office/drawing/2016/5/11/chartex" xmlns:cx6="http://schemas.microsoft.com/office/drawing/2016/5/12/chartex" xmlns:cx7="http://schemas.microsoft.com/office/drawing/2016/5/13/chartex" xmlns:cx8="http://schemas.microsoft.com/office/drawing/2016/5/14/chartex" xmlns:mc="http://schemas.openxmlformats.org/markup-compatibility/2006" xmlns:aink="http://schemas.microsoft.com/office/drawing/2016/ink" xmlns:am3d="http://schemas.microsoft.com/office/drawing/2017/model3d" xmlns:o="urn:schemas-microsoft-com:office:office" xmlns:oel="http://schemas.microsoft.com/office/2019/extlst" xmlns:r="http://schemas.openxmlformats.org/officeDocument/2006/relationships" xmlns:m="http://schemas.openxmlformats.org/officeDocument/2006/math" xmlns:v="urn:schemas-microsoft-com:vml" xmlns:wp14="http://schemas.microsoft.com/office/word/2010/wordprocessingDrawing" xmlns:wp="http://schemas.openxmlformats.org/drawingml/2006/wordprocessingDrawing" xmlns:w10="urn:schemas-microsoft-com:office:word" xmlns:w="http://schemas.openxmlformats.org/wordprocessingml/2006/main" xmlns:w14="http://schemas.microsoft.com/office/word/2010/wordml" xmlns:w15="http://schemas.microsoft.com/office/word/2012/wordml" xmlns:w16cex="http://schemas.microsoft.com/office/word/2018/wordml/cex" xmlns:w16cid="http://schemas.microsoft.com/office/word/2016/wordml/cid" xmlns:w16="http://schemas.microsoft.com/office/word/2018/wordml" xmlns:w16du="http://schemas.microsoft.com/office/word/2023/wordml/word16du" xmlns:w16sdtdh="http://schemas.microsoft.com/office/word/2020/wordml/sdtdatahash" xmlns:w16sdtfl="http://schemas.microsoft.com/office/word/2024/wordml/sdtformatlock" xmlns:w16se="http://schemas.microsoft.com/office/word/2015/wordml/symex" xmlns:wpg="http://schemas.microsoft.com/office/word/2010/wordprocessingGroup" xmlns:wpi="http://schemas.microsoft.com/office/word/2010/wordprocessingInk" xmlns:wne="http://schemas.microsoft.com/office/word/2006/wordml" xmlns:wps="http://schemas.microsoft.com/office/word/2010/wordprocessingShape" mc:Ignorable="w14 w15 w16se w16cid w16 w16cex w16sdtdh w16sdtfl w16du wp14">
   <w:abstractNum w:abstractNumId="0" w15:restartNumberingAfterBreak="0">
     <w:nsid w:val="00A2661A"/>
@@ -8393,910 +8254,7 @@
 </w:numbering>
 </file>
 
-<file path=word\settings.xml><?xml version="1.0" encoding="utf-8"?>
-<w:settings xmlns:mc="http://schemas.openxmlformats.org/markup-compatibility/2006" xmlns:o="urn:schemas-microsoft-com:office:office" xmlns:r="http://schemas.openxmlformats.org/officeDocument/2006/relationships" xmlns:m="http://schemas.openxmlformats.org/officeDocument/2006/math" xmlns:v="urn:schemas-microsoft-com:vml" xmlns:w10="urn:schemas-microsoft-com:office:word" xmlns:w="http://schemas.openxmlformats.org/wordprocessingml/2006/main" xmlns:w14="http://schemas.microsoft.com/office/word/2010/wordml" xmlns:w15="http://schemas.microsoft.com/office/word/2012/wordml" xmlns:w16cex="http://schemas.microsoft.com/office/word/2018/wordml/cex" xmlns:w16cid="http://schemas.microsoft.com/office/word/2016/wordml/cid" xmlns:w16="http://schemas.microsoft.com/office/word/2018/wordml" xmlns:w16du="http://schemas.microsoft.com/office/word/2023/wordml/word16du" xmlns:w16sdtdh="http://schemas.microsoft.com/office/word/2020/wordml/sdtdatahash" xmlns:w16sdtfl="http://schemas.microsoft.com/office/word/2024/wordml/sdtformatlock" xmlns:w16se="http://schemas.microsoft.com/office/word/2015/wordml/symex" xmlns:sl="http://schemas.openxmlformats.org/schemaLibrary/2006/main" mc:Ignorable="w14 w15 w16se w16cid w16 w16cex w16sdtdh w16sdtfl w16du">
-  <w:zoom w:percent="140"/>
-  <w:bordersDoNotSurroundHeader/>
-  <w:bordersDoNotSurroundFooter/>
-  <w:proofState w:spelling="clean" w:grammar="clean"/>
-  <w:defaultTabStop w:val="720"/>
-  <w:characterSpacingControl w:val="doNotCompress"/>
-  <w:hdrShapeDefaults>
-    <o:shapedefaults v:ext="edit" spidmax="2050"/>
-  </w:hdrShapeDefaults>
-  <w:footnotePr>
-    <w:footnote w:id="-1"/>
-    <w:footnote w:id="0"/>
-  </w:footnotePr>
-  <w:endnotePr>
-    <w:endnote w:id="-1"/>
-    <w:endnote w:id="0"/>
-  </w:endnotePr>
-  <w:compat>
-    <w:useFELayout/>
-    <w:compatSetting w:name="compatibilityMode" w:uri="http://schemas.microsoft.com/office/word" w:val="15"/>
-    <w:compatSetting w:name="overrideTableStyleFontSizeAndJustification" w:uri="http://schemas.microsoft.com/office/word" w:val="1"/>
-    <w:compatSetting w:name="enableOpenTypeFeatures" w:uri="http://schemas.microsoft.com/office/word" w:val="1"/>
-    <w:compatSetting w:name="doNotFlipMirrorIndents" w:uri="http://schemas.microsoft.com/office/word" w:val="1"/>
-    <w:compatSetting w:name="differentiateMultirowTableHeaders" w:uri="http://schemas.microsoft.com/office/word" w:val="1"/>
-    <w:compatSetting w:name="useWord2013TrackBottomHyphenation" w:uri="http://schemas.microsoft.com/office/word" w:val="1"/>
-  </w:compat>
-  <w:docVars>
-    <w:docVar w:name="EN.InstantFormat" w:val="&lt;ENInstantFormat&gt;&lt;Enabled&gt;1&lt;/Enabled&gt;&lt;ScanUnformatted&gt;1&lt;/ScanUnformatted&gt;&lt;ScanChanges&gt;1&lt;/ScanChanges&gt;&lt;Suspended&gt;0&lt;/Suspended&gt;&lt;/ENInstantFormat&gt;"/>
-    <w:docVar w:name="EN.Layout" w:val="&lt;ENLayout&gt;&lt;Style&gt;ecological journal&lt;/Style&gt;&lt;LeftDelim&gt;{&lt;/LeftDelim&gt;&lt;RightDelim&gt;}&lt;/RightDelim&gt;&lt;FontName&gt;Calibri&lt;/FontName&gt;&lt;FontSize&gt;11&lt;/FontSize&gt;&lt;ReflistTitle&gt;&lt;/ReflistTitle&gt;&lt;StartingRefnum&gt;1&lt;/StartingRefnum&gt;&lt;FirstLineIndent&gt;0&lt;/FirstLineIndent&gt;&lt;HangingIndent&gt;720&lt;/HangingIndent&gt;&lt;LineSpacing&gt;0&lt;/LineSpacing&gt;&lt;SpaceAfter&gt;0&lt;/SpaceAfter&gt;&lt;HyperlinksEnabled&gt;0&lt;/HyperlinksEnabled&gt;&lt;HyperlinksVisible&gt;0&lt;/HyperlinksVisible&gt;&lt;EnableBibliographyCategories&gt;0&lt;/EnableBibliographyCategories&gt;&lt;/ENLayout&gt;"/>
-    <w:docVar w:name="EN.Libraries" w:val="&lt;Libraries&gt;&lt;item db-id=&quot;v2v9spp9j5rfrqep52hvwfzjepzp9drep0vp&quot;&gt;My EndNote Library1-Saved&lt;record-ids&gt;&lt;item&gt;276&lt;/item&gt;&lt;/record-ids&gt;&lt;/item&gt;&lt;/Libraries&gt;"/>
-  </w:docVars>
-  <w:rsids>
-    <w:rsidRoot w:val="00C272C8"/>
-    <w:rsid w:val="000022FB"/>
-    <w:rsid w:val="0000244F"/>
-    <w:rsid w:val="00004BE3"/>
-    <w:rsid w:val="00010766"/>
-    <w:rsid w:val="000108E1"/>
-    <w:rsid w:val="00013B03"/>
-    <w:rsid w:val="00013C22"/>
-    <w:rsid w:val="00016891"/>
-    <w:rsid w:val="00021139"/>
-    <w:rsid w:val="00024DA2"/>
-    <w:rsid w:val="00030F5D"/>
-    <w:rsid w:val="00034432"/>
-    <w:rsid w:val="00035D15"/>
-    <w:rsid w:val="00037A56"/>
-    <w:rsid w:val="000426E6"/>
-    <w:rsid w:val="00043C07"/>
-    <w:rsid w:val="000443C7"/>
-    <w:rsid w:val="000459A7"/>
-    <w:rsid w:val="000468B8"/>
-    <w:rsid w:val="000536D0"/>
-    <w:rsid w:val="00054F39"/>
-    <w:rsid w:val="00057C6E"/>
-    <w:rsid w:val="0006254D"/>
-    <w:rsid w:val="00066364"/>
-    <w:rsid w:val="00066611"/>
-    <w:rsid w:val="000703B9"/>
-    <w:rsid w:val="000773E6"/>
-    <w:rsid w:val="00084A44"/>
-    <w:rsid w:val="000938BB"/>
-    <w:rsid w:val="00094ABA"/>
-    <w:rsid w:val="00095390"/>
-    <w:rsid w:val="000A04B4"/>
-    <w:rsid w:val="000A1046"/>
-    <w:rsid w:val="000A5806"/>
-    <w:rsid w:val="000B311D"/>
-    <w:rsid w:val="000C1AD2"/>
-    <w:rsid w:val="000C47C8"/>
-    <w:rsid w:val="000D4841"/>
-    <w:rsid w:val="000D4909"/>
-    <w:rsid w:val="000D4BC6"/>
-    <w:rsid w:val="000D582C"/>
-    <w:rsid w:val="000D6983"/>
-    <w:rsid w:val="000E31CF"/>
-    <w:rsid w:val="000E424D"/>
-    <w:rsid w:val="000E6186"/>
-    <w:rsid w:val="000E6D8D"/>
-    <w:rsid w:val="000E7766"/>
-    <w:rsid w:val="000F1D5F"/>
-    <w:rsid w:val="000F247E"/>
-    <w:rsid w:val="000F5D7C"/>
-    <w:rsid w:val="000F6C23"/>
-    <w:rsid w:val="0010159F"/>
-    <w:rsid w:val="001042A2"/>
-    <w:rsid w:val="00104DCE"/>
-    <w:rsid w:val="001072EB"/>
-    <w:rsid w:val="001078C4"/>
-    <w:rsid w:val="0011597C"/>
-    <w:rsid w:val="00116EBC"/>
-    <w:rsid w:val="00117807"/>
-    <w:rsid w:val="00120AB7"/>
-    <w:rsid w:val="0012175F"/>
-    <w:rsid w:val="00121BED"/>
-    <w:rsid w:val="0012233D"/>
-    <w:rsid w:val="0012484D"/>
-    <w:rsid w:val="00126410"/>
-    <w:rsid w:val="00126D23"/>
-    <w:rsid w:val="00127EDF"/>
-    <w:rsid w:val="00140C54"/>
-    <w:rsid w:val="00143D9C"/>
-    <w:rsid w:val="00144B50"/>
-    <w:rsid w:val="0014646F"/>
-    <w:rsid w:val="00155D5D"/>
-    <w:rsid w:val="00160616"/>
-    <w:rsid w:val="00161215"/>
-    <w:rsid w:val="00163D7D"/>
-    <w:rsid w:val="00165519"/>
-    <w:rsid w:val="0017327A"/>
-    <w:rsid w:val="00175CBE"/>
-    <w:rsid w:val="00176DBD"/>
-    <w:rsid w:val="00183C3B"/>
-    <w:rsid w:val="00185EFA"/>
-    <w:rsid w:val="00195E46"/>
-    <w:rsid w:val="00197556"/>
-    <w:rsid w:val="001A1660"/>
-    <w:rsid w:val="001A4F6B"/>
-    <w:rsid w:val="001A5F68"/>
-    <w:rsid w:val="001B13C2"/>
-    <w:rsid w:val="001B1C65"/>
-    <w:rsid w:val="001B40F5"/>
-    <w:rsid w:val="001B68DE"/>
-    <w:rsid w:val="001B7AF5"/>
-    <w:rsid w:val="001C2A25"/>
-    <w:rsid w:val="001C7448"/>
-    <w:rsid w:val="001C764B"/>
-    <w:rsid w:val="001D03DF"/>
-    <w:rsid w:val="001E3800"/>
-    <w:rsid w:val="001E46DA"/>
-    <w:rsid w:val="001E5A3A"/>
-    <w:rsid w:val="001E6120"/>
-    <w:rsid w:val="001E6E39"/>
-    <w:rsid w:val="001F5627"/>
-    <w:rsid w:val="001F6B85"/>
-    <w:rsid w:val="002036D7"/>
-    <w:rsid w:val="00205CE8"/>
-    <w:rsid w:val="00206B44"/>
-    <w:rsid w:val="002175BB"/>
-    <w:rsid w:val="00233689"/>
-    <w:rsid w:val="002361C6"/>
-    <w:rsid w:val="00237BD1"/>
-    <w:rsid w:val="00247494"/>
-    <w:rsid w:val="00247E99"/>
-    <w:rsid w:val="00253DE0"/>
-    <w:rsid w:val="00256D2E"/>
-    <w:rsid w:val="00256E2A"/>
-    <w:rsid w:val="00262ADA"/>
-    <w:rsid w:val="00264B3C"/>
-    <w:rsid w:val="00267D4E"/>
-    <w:rsid w:val="00274474"/>
-    <w:rsid w:val="0027454A"/>
-    <w:rsid w:val="002772ED"/>
-    <w:rsid w:val="00281FAB"/>
-    <w:rsid w:val="002850E1"/>
-    <w:rsid w:val="0028621F"/>
-    <w:rsid w:val="002961FF"/>
-    <w:rsid w:val="002979A6"/>
-    <w:rsid w:val="00297B84"/>
-    <w:rsid w:val="002A1F14"/>
-    <w:rsid w:val="002A7EEF"/>
-    <w:rsid w:val="002B0BCE"/>
-    <w:rsid w:val="002B1DE1"/>
-    <w:rsid w:val="002B29E0"/>
-    <w:rsid w:val="002B5899"/>
-    <w:rsid w:val="002B62D5"/>
-    <w:rsid w:val="002B6E9C"/>
-    <w:rsid w:val="002B71D2"/>
-    <w:rsid w:val="002C6E9B"/>
-    <w:rsid w:val="002C7156"/>
-    <w:rsid w:val="002D3DDE"/>
-    <w:rsid w:val="002D507D"/>
-    <w:rsid w:val="002D52B3"/>
-    <w:rsid w:val="002E3B11"/>
-    <w:rsid w:val="002F23CE"/>
-    <w:rsid w:val="002F4145"/>
-    <w:rsid w:val="002F7DCB"/>
-    <w:rsid w:val="0030001A"/>
-    <w:rsid w:val="003020FF"/>
-    <w:rsid w:val="00307D63"/>
-    <w:rsid w:val="00317E43"/>
-    <w:rsid w:val="00324245"/>
-    <w:rsid w:val="00327D53"/>
-    <w:rsid w:val="00327FEB"/>
-    <w:rsid w:val="0033270A"/>
-    <w:rsid w:val="003351BE"/>
-    <w:rsid w:val="00336A57"/>
-    <w:rsid w:val="00340AAB"/>
-    <w:rsid w:val="003417FC"/>
-    <w:rsid w:val="00344303"/>
-    <w:rsid w:val="00345D26"/>
-    <w:rsid w:val="00345E13"/>
-    <w:rsid w:val="0034713F"/>
-    <w:rsid w:val="00353778"/>
-    <w:rsid w:val="00355DE5"/>
-    <w:rsid w:val="003573CC"/>
-    <w:rsid w:val="0036306A"/>
-    <w:rsid w:val="00363FEA"/>
-    <w:rsid w:val="00364957"/>
-    <w:rsid w:val="003651A3"/>
-    <w:rsid w:val="0036745B"/>
-    <w:rsid w:val="00367AE3"/>
-    <w:rsid w:val="00371871"/>
-    <w:rsid w:val="00373A9C"/>
-    <w:rsid w:val="00373C5E"/>
-    <w:rsid w:val="00374323"/>
-    <w:rsid w:val="00380981"/>
-    <w:rsid w:val="003810C0"/>
-    <w:rsid w:val="0038410B"/>
-    <w:rsid w:val="00384585"/>
-    <w:rsid w:val="003874C2"/>
-    <w:rsid w:val="00392D45"/>
-    <w:rsid w:val="00397590"/>
-    <w:rsid w:val="003A0C1F"/>
-    <w:rsid w:val="003A29E5"/>
-    <w:rsid w:val="003A4988"/>
-    <w:rsid w:val="003B0E84"/>
-    <w:rsid w:val="003B1632"/>
-    <w:rsid w:val="003B5162"/>
-    <w:rsid w:val="003B546A"/>
-    <w:rsid w:val="003B67A5"/>
-    <w:rsid w:val="003B7E40"/>
-    <w:rsid w:val="003C06E8"/>
-    <w:rsid w:val="003C1F51"/>
-    <w:rsid w:val="003C1FF5"/>
-    <w:rsid w:val="003C71E8"/>
-    <w:rsid w:val="003D797F"/>
-    <w:rsid w:val="003E28C2"/>
-    <w:rsid w:val="003E3FC1"/>
-    <w:rsid w:val="003E6254"/>
-    <w:rsid w:val="003F33FD"/>
-    <w:rsid w:val="003F453A"/>
-    <w:rsid w:val="003F6A2A"/>
-    <w:rsid w:val="003F7569"/>
-    <w:rsid w:val="004038D5"/>
-    <w:rsid w:val="00405AA0"/>
-    <w:rsid w:val="00411938"/>
-    <w:rsid w:val="00413772"/>
-    <w:rsid w:val="00422B19"/>
-    <w:rsid w:val="0042327A"/>
-    <w:rsid w:val="00425BF7"/>
-    <w:rsid w:val="004274BF"/>
-    <w:rsid w:val="00427F38"/>
-    <w:rsid w:val="00431518"/>
-    <w:rsid w:val="00433454"/>
-    <w:rsid w:val="00434216"/>
-    <w:rsid w:val="00434BD9"/>
-    <w:rsid w:val="00434DE1"/>
-    <w:rsid w:val="00434EBE"/>
-    <w:rsid w:val="0043549C"/>
-    <w:rsid w:val="00435599"/>
-    <w:rsid w:val="004367E2"/>
-    <w:rsid w:val="0044073F"/>
-    <w:rsid w:val="00440E9A"/>
-    <w:rsid w:val="00440F9D"/>
-    <w:rsid w:val="004460B1"/>
-    <w:rsid w:val="00447D9E"/>
-    <w:rsid w:val="0045095D"/>
-    <w:rsid w:val="00451511"/>
-    <w:rsid w:val="0045226C"/>
-    <w:rsid w:val="00452697"/>
-    <w:rsid w:val="00454723"/>
-    <w:rsid w:val="00460150"/>
-    <w:rsid w:val="00461728"/>
-    <w:rsid w:val="00473CC6"/>
-    <w:rsid w:val="004770E8"/>
-    <w:rsid w:val="00481B17"/>
-    <w:rsid w:val="004832ED"/>
-    <w:rsid w:val="00487621"/>
-    <w:rsid w:val="00490285"/>
-    <w:rsid w:val="00495010"/>
-    <w:rsid w:val="00495088"/>
-    <w:rsid w:val="00497B39"/>
-    <w:rsid w:val="004A0837"/>
-    <w:rsid w:val="004A2C87"/>
-    <w:rsid w:val="004A39EF"/>
-    <w:rsid w:val="004A40B2"/>
-    <w:rsid w:val="004A6137"/>
-    <w:rsid w:val="004A6723"/>
-    <w:rsid w:val="004B796E"/>
-    <w:rsid w:val="004B7E17"/>
-    <w:rsid w:val="004C4312"/>
-    <w:rsid w:val="004C461E"/>
-    <w:rsid w:val="004C733C"/>
-    <w:rsid w:val="004D0360"/>
-    <w:rsid w:val="004D1BF4"/>
-    <w:rsid w:val="004D6DDB"/>
-    <w:rsid w:val="004E14A1"/>
-    <w:rsid w:val="004E43FC"/>
-    <w:rsid w:val="004E5166"/>
-    <w:rsid w:val="004E764D"/>
-    <w:rsid w:val="004E7E15"/>
-    <w:rsid w:val="004F1E41"/>
-    <w:rsid w:val="004F47CE"/>
-    <w:rsid w:val="004F7E89"/>
-    <w:rsid w:val="00502602"/>
-    <w:rsid w:val="00506A12"/>
-    <w:rsid w:val="00507431"/>
-    <w:rsid w:val="005117A8"/>
-    <w:rsid w:val="00511B51"/>
-    <w:rsid w:val="00514F51"/>
-    <w:rsid w:val="00521985"/>
-    <w:rsid w:val="00522DE8"/>
-    <w:rsid w:val="00524104"/>
-    <w:rsid w:val="00524F98"/>
-    <w:rsid w:val="00526DB6"/>
-    <w:rsid w:val="005410FB"/>
-    <w:rsid w:val="00547932"/>
-    <w:rsid w:val="005555AD"/>
-    <w:rsid w:val="0055680C"/>
-    <w:rsid w:val="00557A50"/>
-    <w:rsid w:val="00557D0B"/>
-    <w:rsid w:val="005637A9"/>
-    <w:rsid w:val="005657C7"/>
-    <w:rsid w:val="00567888"/>
-    <w:rsid w:val="00571AC2"/>
-    <w:rsid w:val="00571FA9"/>
-    <w:rsid w:val="0057347B"/>
-    <w:rsid w:val="00581E7C"/>
-    <w:rsid w:val="00583A3B"/>
-    <w:rsid w:val="0059371A"/>
-    <w:rsid w:val="00595234"/>
-    <w:rsid w:val="0059608E"/>
-    <w:rsid w:val="005A1369"/>
-    <w:rsid w:val="005A1D45"/>
-    <w:rsid w:val="005A2FD5"/>
-    <w:rsid w:val="005A3423"/>
-    <w:rsid w:val="005A6805"/>
-    <w:rsid w:val="005A7EC1"/>
-    <w:rsid w:val="005A7EEE"/>
-    <w:rsid w:val="005B0DFB"/>
-    <w:rsid w:val="005B1E66"/>
-    <w:rsid w:val="005B4607"/>
-    <w:rsid w:val="005C1687"/>
-    <w:rsid w:val="005C6AE5"/>
-    <w:rsid w:val="005C771A"/>
-    <w:rsid w:val="005D2270"/>
-    <w:rsid w:val="005D2423"/>
-    <w:rsid w:val="005D27D0"/>
-    <w:rsid w:val="005D354B"/>
-    <w:rsid w:val="005D73DD"/>
-    <w:rsid w:val="005D74D7"/>
-    <w:rsid w:val="005E0749"/>
-    <w:rsid w:val="005E1023"/>
-    <w:rsid w:val="005E3139"/>
-    <w:rsid w:val="005E4C16"/>
-    <w:rsid w:val="005E6608"/>
-    <w:rsid w:val="005E7FC7"/>
-    <w:rsid w:val="005F5A7E"/>
-    <w:rsid w:val="005F6260"/>
-    <w:rsid w:val="006023BC"/>
-    <w:rsid w:val="00602DF1"/>
-    <w:rsid w:val="006047E7"/>
-    <w:rsid w:val="00613398"/>
-    <w:rsid w:val="00621CC4"/>
-    <w:rsid w:val="00622946"/>
-    <w:rsid w:val="006261A2"/>
-    <w:rsid w:val="00626691"/>
-    <w:rsid w:val="00630FCF"/>
-    <w:rsid w:val="00633051"/>
-    <w:rsid w:val="00633E0C"/>
-    <w:rsid w:val="0063480D"/>
-    <w:rsid w:val="00635E16"/>
-    <w:rsid w:val="00636BB2"/>
-    <w:rsid w:val="00641759"/>
-    <w:rsid w:val="00644D49"/>
-    <w:rsid w:val="00644EE2"/>
-    <w:rsid w:val="00645E78"/>
-    <w:rsid w:val="006467DD"/>
-    <w:rsid w:val="00650D8B"/>
-    <w:rsid w:val="006542CD"/>
-    <w:rsid w:val="006577BC"/>
-    <w:rsid w:val="00661169"/>
-    <w:rsid w:val="00662C17"/>
-    <w:rsid w:val="0066747A"/>
-    <w:rsid w:val="00667E6F"/>
-    <w:rsid w:val="0067114E"/>
-    <w:rsid w:val="006747A1"/>
-    <w:rsid w:val="006769CF"/>
-    <w:rsid w:val="00686171"/>
-    <w:rsid w:val="00692A18"/>
-    <w:rsid w:val="006933AA"/>
-    <w:rsid w:val="0069460F"/>
-    <w:rsid w:val="00694E52"/>
-    <w:rsid w:val="00695645"/>
-    <w:rsid w:val="00695E76"/>
-    <w:rsid w:val="006960CD"/>
-    <w:rsid w:val="006A1EEA"/>
-    <w:rsid w:val="006A2099"/>
-    <w:rsid w:val="006A4269"/>
-    <w:rsid w:val="006A5D98"/>
-    <w:rsid w:val="006B1B4C"/>
-    <w:rsid w:val="006B342E"/>
-    <w:rsid w:val="006B3E47"/>
-    <w:rsid w:val="006B43EA"/>
-    <w:rsid w:val="006B591A"/>
-    <w:rsid w:val="006B5A6F"/>
-    <w:rsid w:val="006C3C53"/>
-    <w:rsid w:val="006C41FA"/>
-    <w:rsid w:val="006C4654"/>
-    <w:rsid w:val="006D00AE"/>
-    <w:rsid w:val="006D059A"/>
-    <w:rsid w:val="006D09AF"/>
-    <w:rsid w:val="006D1F5C"/>
-    <w:rsid w:val="006D609C"/>
-    <w:rsid w:val="006E4214"/>
-    <w:rsid w:val="00701517"/>
-    <w:rsid w:val="00702256"/>
-    <w:rsid w:val="0070353C"/>
-    <w:rsid w:val="00705031"/>
-    <w:rsid w:val="00712010"/>
-    <w:rsid w:val="00712B8B"/>
-    <w:rsid w:val="0071477A"/>
-    <w:rsid w:val="00720B84"/>
-    <w:rsid w:val="007275A7"/>
-    <w:rsid w:val="007301B2"/>
-    <w:rsid w:val="0073072B"/>
-    <w:rsid w:val="0073422C"/>
-    <w:rsid w:val="00735B68"/>
-    <w:rsid w:val="0073638B"/>
-    <w:rsid w:val="00737D46"/>
-    <w:rsid w:val="007405DD"/>
-    <w:rsid w:val="00743EE8"/>
-    <w:rsid w:val="00744ECA"/>
-    <w:rsid w:val="00745F76"/>
-    <w:rsid w:val="00747DE3"/>
-    <w:rsid w:val="00751D47"/>
-    <w:rsid w:val="007535A1"/>
-    <w:rsid w:val="0075798E"/>
-    <w:rsid w:val="00764D18"/>
-    <w:rsid w:val="00774765"/>
-    <w:rsid w:val="0077681D"/>
-    <w:rsid w:val="007775F1"/>
-    <w:rsid w:val="007779E7"/>
-    <w:rsid w:val="00781665"/>
-    <w:rsid w:val="007823EB"/>
-    <w:rsid w:val="007851AB"/>
-    <w:rsid w:val="007A083E"/>
-    <w:rsid w:val="007A2720"/>
-    <w:rsid w:val="007A3834"/>
-    <w:rsid w:val="007A5437"/>
-    <w:rsid w:val="007B6E1A"/>
-    <w:rsid w:val="007B7BC9"/>
-    <w:rsid w:val="007C02DC"/>
-    <w:rsid w:val="007C478E"/>
-    <w:rsid w:val="007D2634"/>
-    <w:rsid w:val="007D375C"/>
-    <w:rsid w:val="007E1585"/>
-    <w:rsid w:val="007E1F83"/>
-    <w:rsid w:val="007E27DA"/>
-    <w:rsid w:val="007E4473"/>
-    <w:rsid w:val="007F13F4"/>
-    <w:rsid w:val="007F3023"/>
-    <w:rsid w:val="007F3AD3"/>
-    <w:rsid w:val="007F6351"/>
-    <w:rsid w:val="007F671E"/>
-    <w:rsid w:val="00800A62"/>
-    <w:rsid w:val="008027C0"/>
-    <w:rsid w:val="00802D4E"/>
-    <w:rsid w:val="00804DD7"/>
-    <w:rsid w:val="00810290"/>
-    <w:rsid w:val="0081085A"/>
-    <w:rsid w:val="0081261A"/>
-    <w:rsid w:val="008149BA"/>
-    <w:rsid w:val="008223E7"/>
-    <w:rsid w:val="0083323B"/>
-    <w:rsid w:val="00840E92"/>
-    <w:rsid w:val="00843001"/>
-    <w:rsid w:val="0084456F"/>
-    <w:rsid w:val="008516C3"/>
-    <w:rsid w:val="008675A7"/>
-    <w:rsid w:val="00867FD5"/>
-    <w:rsid w:val="008745B6"/>
-    <w:rsid w:val="00882551"/>
-    <w:rsid w:val="00886AC2"/>
-    <w:rsid w:val="00890EC8"/>
-    <w:rsid w:val="008951AD"/>
-    <w:rsid w:val="008A0299"/>
-    <w:rsid w:val="008A0CAD"/>
-    <w:rsid w:val="008A0DB8"/>
-    <w:rsid w:val="008A183D"/>
-    <w:rsid w:val="008B152C"/>
-    <w:rsid w:val="008B39F9"/>
-    <w:rsid w:val="008B4A31"/>
-    <w:rsid w:val="008B68A3"/>
-    <w:rsid w:val="008B77C3"/>
-    <w:rsid w:val="008C27D8"/>
-    <w:rsid w:val="008C2ED4"/>
-    <w:rsid w:val="008C6384"/>
-    <w:rsid w:val="008C6AA8"/>
-    <w:rsid w:val="008D1B1E"/>
-    <w:rsid w:val="008D450F"/>
-    <w:rsid w:val="008D62CA"/>
-    <w:rsid w:val="008D6312"/>
-    <w:rsid w:val="008E1C87"/>
-    <w:rsid w:val="008E2D4E"/>
-    <w:rsid w:val="008E3C50"/>
-    <w:rsid w:val="008E4EE0"/>
-    <w:rsid w:val="00902296"/>
-    <w:rsid w:val="009055BF"/>
-    <w:rsid w:val="00905632"/>
-    <w:rsid w:val="00912094"/>
-    <w:rsid w:val="00914118"/>
-    <w:rsid w:val="0091444F"/>
-    <w:rsid w:val="009173C1"/>
-    <w:rsid w:val="00920ED9"/>
-    <w:rsid w:val="0092124F"/>
-    <w:rsid w:val="009311D5"/>
-    <w:rsid w:val="00935588"/>
-    <w:rsid w:val="0093797B"/>
-    <w:rsid w:val="00937D40"/>
-    <w:rsid w:val="0094127C"/>
-    <w:rsid w:val="009424DC"/>
-    <w:rsid w:val="00943E04"/>
-    <w:rsid w:val="00950EA8"/>
-    <w:rsid w:val="00951E7C"/>
-    <w:rsid w:val="00953D5D"/>
-    <w:rsid w:val="00956385"/>
-    <w:rsid w:val="00960238"/>
-    <w:rsid w:val="00961875"/>
-    <w:rsid w:val="00962CDD"/>
-    <w:rsid w:val="0096319B"/>
-    <w:rsid w:val="00966033"/>
-    <w:rsid w:val="00971D4A"/>
-    <w:rsid w:val="00972550"/>
-    <w:rsid w:val="009733CC"/>
-    <w:rsid w:val="00973FCA"/>
-    <w:rsid w:val="009753E7"/>
-    <w:rsid w:val="00975529"/>
-    <w:rsid w:val="009801F9"/>
-    <w:rsid w:val="0098772D"/>
-    <w:rsid w:val="00987CDE"/>
-    <w:rsid w:val="00992E5E"/>
-    <w:rsid w:val="00993BDD"/>
-    <w:rsid w:val="00995237"/>
-    <w:rsid w:val="00995316"/>
-    <w:rsid w:val="0099535B"/>
-    <w:rsid w:val="009A14E8"/>
-    <w:rsid w:val="009A2A10"/>
-    <w:rsid w:val="009A3D4F"/>
-    <w:rsid w:val="009A4F7C"/>
-    <w:rsid w:val="009A5D76"/>
-    <w:rsid w:val="009B1464"/>
-    <w:rsid w:val="009D0321"/>
-    <w:rsid w:val="009D1BEC"/>
-    <w:rsid w:val="009D3BF4"/>
-    <w:rsid w:val="009D5D92"/>
-    <w:rsid w:val="009D758F"/>
-    <w:rsid w:val="009E124C"/>
-    <w:rsid w:val="009E35CE"/>
-    <w:rsid w:val="009E6A9D"/>
-    <w:rsid w:val="009F28E4"/>
-    <w:rsid w:val="009F5A51"/>
-    <w:rsid w:val="00A02AAD"/>
-    <w:rsid w:val="00A04411"/>
-    <w:rsid w:val="00A14F33"/>
-    <w:rsid w:val="00A17558"/>
-    <w:rsid w:val="00A3374A"/>
-    <w:rsid w:val="00A34E79"/>
-    <w:rsid w:val="00A43A98"/>
-    <w:rsid w:val="00A44033"/>
-    <w:rsid w:val="00A449EA"/>
-    <w:rsid w:val="00A45571"/>
-    <w:rsid w:val="00A46916"/>
-    <w:rsid w:val="00A507C2"/>
-    <w:rsid w:val="00A51A43"/>
-    <w:rsid w:val="00A54A54"/>
-    <w:rsid w:val="00A60D4D"/>
-    <w:rsid w:val="00A665CD"/>
-    <w:rsid w:val="00A66FF3"/>
-    <w:rsid w:val="00A70E03"/>
-    <w:rsid w:val="00A725E9"/>
-    <w:rsid w:val="00A74FC8"/>
-    <w:rsid w:val="00A80488"/>
-    <w:rsid w:val="00A811A3"/>
-    <w:rsid w:val="00A8669F"/>
-    <w:rsid w:val="00A94975"/>
-    <w:rsid w:val="00A94CCE"/>
-    <w:rsid w:val="00A9624F"/>
-    <w:rsid w:val="00A97649"/>
-    <w:rsid w:val="00AA09E6"/>
-    <w:rsid w:val="00AA109C"/>
-    <w:rsid w:val="00AA16EF"/>
-    <w:rsid w:val="00AA71D7"/>
-    <w:rsid w:val="00AB00BB"/>
-    <w:rsid w:val="00AB1A3C"/>
-    <w:rsid w:val="00AB3566"/>
-    <w:rsid w:val="00AB3943"/>
-    <w:rsid w:val="00AB412A"/>
-    <w:rsid w:val="00AB6D4A"/>
-    <w:rsid w:val="00AC216D"/>
-    <w:rsid w:val="00AC2EC6"/>
-    <w:rsid w:val="00AC3681"/>
-    <w:rsid w:val="00AC5E3D"/>
-    <w:rsid w:val="00AD1017"/>
-    <w:rsid w:val="00AD11C4"/>
-    <w:rsid w:val="00AD37B1"/>
-    <w:rsid w:val="00AD5AC8"/>
-    <w:rsid w:val="00AD6F2F"/>
-    <w:rsid w:val="00AE3E86"/>
-    <w:rsid w:val="00AE5F6E"/>
-    <w:rsid w:val="00AF251F"/>
-    <w:rsid w:val="00AF542C"/>
-    <w:rsid w:val="00AF5447"/>
-    <w:rsid w:val="00AF70D6"/>
-    <w:rsid w:val="00B032B6"/>
-    <w:rsid w:val="00B039AB"/>
-    <w:rsid w:val="00B07A0C"/>
-    <w:rsid w:val="00B15137"/>
-    <w:rsid w:val="00B15EAB"/>
-    <w:rsid w:val="00B167BC"/>
-    <w:rsid w:val="00B2054D"/>
-    <w:rsid w:val="00B25CB1"/>
-    <w:rsid w:val="00B265E3"/>
-    <w:rsid w:val="00B31B58"/>
-    <w:rsid w:val="00B336ED"/>
-    <w:rsid w:val="00B34AD3"/>
-    <w:rsid w:val="00B35303"/>
-    <w:rsid w:val="00B356B4"/>
-    <w:rsid w:val="00B35E4C"/>
-    <w:rsid w:val="00B37A5E"/>
-    <w:rsid w:val="00B41B17"/>
-    <w:rsid w:val="00B4741D"/>
-    <w:rsid w:val="00B52C9E"/>
-    <w:rsid w:val="00B55F9F"/>
-    <w:rsid w:val="00B56415"/>
-    <w:rsid w:val="00B565FA"/>
-    <w:rsid w:val="00B602D3"/>
-    <w:rsid w:val="00B636D2"/>
-    <w:rsid w:val="00B650B0"/>
-    <w:rsid w:val="00B651C7"/>
-    <w:rsid w:val="00B7187B"/>
-    <w:rsid w:val="00B73125"/>
-    <w:rsid w:val="00B948E9"/>
-    <w:rsid w:val="00B95496"/>
-    <w:rsid w:val="00B954B1"/>
-    <w:rsid w:val="00B96700"/>
-    <w:rsid w:val="00B97C81"/>
-    <w:rsid w:val="00BB05C2"/>
-    <w:rsid w:val="00BB6B3D"/>
-    <w:rsid w:val="00BB6F69"/>
-    <w:rsid w:val="00BC4705"/>
-    <w:rsid w:val="00BC7A1D"/>
-    <w:rsid w:val="00BD4A41"/>
-    <w:rsid w:val="00BD59D5"/>
-    <w:rsid w:val="00BD7BF8"/>
-    <w:rsid w:val="00BE1D05"/>
-    <w:rsid w:val="00BE22B3"/>
-    <w:rsid w:val="00BE3506"/>
-    <w:rsid w:val="00BF005F"/>
-    <w:rsid w:val="00BF1BF5"/>
-    <w:rsid w:val="00BF2D27"/>
-    <w:rsid w:val="00BF3419"/>
-    <w:rsid w:val="00C003EA"/>
-    <w:rsid w:val="00C03805"/>
-    <w:rsid w:val="00C0538F"/>
-    <w:rsid w:val="00C07235"/>
-    <w:rsid w:val="00C100C7"/>
-    <w:rsid w:val="00C1199C"/>
-    <w:rsid w:val="00C128D0"/>
-    <w:rsid w:val="00C12DA2"/>
-    <w:rsid w:val="00C13A33"/>
-    <w:rsid w:val="00C169B7"/>
-    <w:rsid w:val="00C16F3F"/>
-    <w:rsid w:val="00C1747E"/>
-    <w:rsid w:val="00C213C2"/>
-    <w:rsid w:val="00C21AF8"/>
-    <w:rsid w:val="00C26762"/>
-    <w:rsid w:val="00C2680F"/>
-    <w:rsid w:val="00C272C8"/>
-    <w:rsid w:val="00C36157"/>
-    <w:rsid w:val="00C44B25"/>
-    <w:rsid w:val="00C45ECC"/>
-    <w:rsid w:val="00C462BB"/>
-    <w:rsid w:val="00C52513"/>
-    <w:rsid w:val="00C529CA"/>
-    <w:rsid w:val="00C54259"/>
-    <w:rsid w:val="00C55300"/>
-    <w:rsid w:val="00C73241"/>
-    <w:rsid w:val="00C75634"/>
-    <w:rsid w:val="00C76477"/>
-    <w:rsid w:val="00C80E50"/>
-    <w:rsid w:val="00C82B5F"/>
-    <w:rsid w:val="00C8749F"/>
-    <w:rsid w:val="00C87BCB"/>
-    <w:rsid w:val="00C90E75"/>
-    <w:rsid w:val="00C97FC8"/>
-    <w:rsid w:val="00CA5360"/>
-    <w:rsid w:val="00CA5D2A"/>
-    <w:rsid w:val="00CB317C"/>
-    <w:rsid w:val="00CB4BC5"/>
-    <w:rsid w:val="00CB530C"/>
-    <w:rsid w:val="00CB5C79"/>
-    <w:rsid w:val="00CC13B8"/>
-    <w:rsid w:val="00CC199E"/>
-    <w:rsid w:val="00CC23AD"/>
-    <w:rsid w:val="00CD3999"/>
-    <w:rsid w:val="00CD59A8"/>
-    <w:rsid w:val="00CD6484"/>
-    <w:rsid w:val="00CD6E94"/>
-    <w:rsid w:val="00CE7278"/>
-    <w:rsid w:val="00CF0F0B"/>
-    <w:rsid w:val="00CF16B4"/>
-    <w:rsid w:val="00CF1909"/>
-    <w:rsid w:val="00CF2A37"/>
-    <w:rsid w:val="00CF31CB"/>
-    <w:rsid w:val="00CF3B76"/>
-    <w:rsid w:val="00CF46CB"/>
-    <w:rsid w:val="00D01C76"/>
-    <w:rsid w:val="00D0200D"/>
-    <w:rsid w:val="00D0276D"/>
-    <w:rsid w:val="00D04EA6"/>
-    <w:rsid w:val="00D06A15"/>
-    <w:rsid w:val="00D06F0B"/>
-    <w:rsid w:val="00D13553"/>
-    <w:rsid w:val="00D1729E"/>
-    <w:rsid w:val="00D234DB"/>
-    <w:rsid w:val="00D2743A"/>
-    <w:rsid w:val="00D34CC5"/>
-    <w:rsid w:val="00D36E77"/>
-    <w:rsid w:val="00D45AAA"/>
-    <w:rsid w:val="00D46E25"/>
-    <w:rsid w:val="00D54D7F"/>
-    <w:rsid w:val="00D54F66"/>
-    <w:rsid w:val="00D61468"/>
-    <w:rsid w:val="00D623CC"/>
-    <w:rsid w:val="00D62D75"/>
-    <w:rsid w:val="00D634FD"/>
-    <w:rsid w:val="00D647F7"/>
-    <w:rsid w:val="00D7210A"/>
-    <w:rsid w:val="00D80078"/>
-    <w:rsid w:val="00D80938"/>
-    <w:rsid w:val="00D827AE"/>
-    <w:rsid w:val="00D869D5"/>
-    <w:rsid w:val="00D90247"/>
-    <w:rsid w:val="00D9322D"/>
-    <w:rsid w:val="00D95137"/>
-    <w:rsid w:val="00D96BED"/>
-    <w:rsid w:val="00DA231B"/>
-    <w:rsid w:val="00DA354C"/>
-    <w:rsid w:val="00DA3A20"/>
-    <w:rsid w:val="00DA59C5"/>
-    <w:rsid w:val="00DA6F12"/>
-    <w:rsid w:val="00DA7330"/>
-    <w:rsid w:val="00DB74CF"/>
-    <w:rsid w:val="00DC65B8"/>
-    <w:rsid w:val="00DC7211"/>
-    <w:rsid w:val="00DD0A19"/>
-    <w:rsid w:val="00DD3562"/>
-    <w:rsid w:val="00DD5448"/>
-    <w:rsid w:val="00DE649C"/>
-    <w:rsid w:val="00DE6DD7"/>
-    <w:rsid w:val="00DF129B"/>
-    <w:rsid w:val="00DF2749"/>
-    <w:rsid w:val="00DF3521"/>
-    <w:rsid w:val="00E00198"/>
-    <w:rsid w:val="00E00531"/>
-    <w:rsid w:val="00E00FF9"/>
-    <w:rsid w:val="00E0140B"/>
-    <w:rsid w:val="00E06454"/>
-    <w:rsid w:val="00E07879"/>
-    <w:rsid w:val="00E11258"/>
-    <w:rsid w:val="00E1315A"/>
-    <w:rsid w:val="00E15944"/>
-    <w:rsid w:val="00E15B6A"/>
-    <w:rsid w:val="00E16711"/>
-    <w:rsid w:val="00E266D2"/>
-    <w:rsid w:val="00E34F43"/>
-    <w:rsid w:val="00E3704A"/>
-    <w:rsid w:val="00E44BC3"/>
-    <w:rsid w:val="00E51BEC"/>
-    <w:rsid w:val="00E53B96"/>
-    <w:rsid w:val="00E54DFC"/>
-    <w:rsid w:val="00E5797A"/>
-    <w:rsid w:val="00E6234A"/>
-    <w:rsid w:val="00E626DE"/>
-    <w:rsid w:val="00E62A80"/>
-    <w:rsid w:val="00E6462C"/>
-    <w:rsid w:val="00E810DB"/>
-    <w:rsid w:val="00E83E8A"/>
-    <w:rsid w:val="00E84C67"/>
-    <w:rsid w:val="00E84CAD"/>
-    <w:rsid w:val="00E857F3"/>
-    <w:rsid w:val="00E862F8"/>
-    <w:rsid w:val="00E86A56"/>
-    <w:rsid w:val="00E87F0F"/>
-    <w:rsid w:val="00E930B8"/>
-    <w:rsid w:val="00E93AC1"/>
-    <w:rsid w:val="00E95FAC"/>
-    <w:rsid w:val="00E96CB2"/>
-    <w:rsid w:val="00EA05F8"/>
-    <w:rsid w:val="00EA0BC4"/>
-    <w:rsid w:val="00EA0DA9"/>
-    <w:rsid w:val="00EA20D3"/>
-    <w:rsid w:val="00EA3AB8"/>
-    <w:rsid w:val="00EA3D54"/>
-    <w:rsid w:val="00EA7D7D"/>
-    <w:rsid w:val="00EB12D1"/>
-    <w:rsid w:val="00EB34E0"/>
-    <w:rsid w:val="00EB409F"/>
-    <w:rsid w:val="00EC1A37"/>
-    <w:rsid w:val="00EC4A2F"/>
-    <w:rsid w:val="00EC4F04"/>
-    <w:rsid w:val="00EC593D"/>
-    <w:rsid w:val="00EC7080"/>
-    <w:rsid w:val="00EC7DDB"/>
-    <w:rsid w:val="00ED3D76"/>
-    <w:rsid w:val="00ED3DDB"/>
-    <w:rsid w:val="00EE0E66"/>
-    <w:rsid w:val="00EE1C64"/>
-    <w:rsid w:val="00EE6D2E"/>
-    <w:rsid w:val="00EE6D6C"/>
-    <w:rsid w:val="00EF086A"/>
-    <w:rsid w:val="00EF1724"/>
-    <w:rsid w:val="00EF20B9"/>
-    <w:rsid w:val="00EF3C5E"/>
-    <w:rsid w:val="00EF657C"/>
-    <w:rsid w:val="00EF6584"/>
-    <w:rsid w:val="00EF7A4C"/>
-    <w:rsid w:val="00F013C8"/>
-    <w:rsid w:val="00F01C21"/>
-    <w:rsid w:val="00F01E6C"/>
-    <w:rsid w:val="00F03D4E"/>
-    <w:rsid w:val="00F15F4B"/>
-    <w:rsid w:val="00F16E36"/>
-    <w:rsid w:val="00F25849"/>
-    <w:rsid w:val="00F269AA"/>
-    <w:rsid w:val="00F31097"/>
-    <w:rsid w:val="00F37A1F"/>
-    <w:rsid w:val="00F407A1"/>
-    <w:rsid w:val="00F4155B"/>
-    <w:rsid w:val="00F42D52"/>
-    <w:rsid w:val="00F472B4"/>
-    <w:rsid w:val="00F47F22"/>
-    <w:rsid w:val="00F510BF"/>
-    <w:rsid w:val="00F650E5"/>
-    <w:rsid w:val="00F668B7"/>
-    <w:rsid w:val="00F6767D"/>
-    <w:rsid w:val="00F75385"/>
-    <w:rsid w:val="00F764F8"/>
-    <w:rsid w:val="00F7743B"/>
-    <w:rsid w:val="00F77AAE"/>
-    <w:rsid w:val="00F805F7"/>
-    <w:rsid w:val="00F8635E"/>
-    <w:rsid w:val="00F90328"/>
-    <w:rsid w:val="00F96A5F"/>
-    <w:rsid w:val="00FA07AE"/>
-    <w:rsid w:val="00FA08DF"/>
-    <w:rsid w:val="00FA1D8E"/>
-    <w:rsid w:val="00FA2448"/>
-    <w:rsid w:val="00FA2689"/>
-    <w:rsid w:val="00FA6A58"/>
-    <w:rsid w:val="00FA7DC4"/>
-    <w:rsid w:val="00FB4195"/>
-    <w:rsid w:val="00FB524E"/>
-    <w:rsid w:val="00FC0C40"/>
-    <w:rsid w:val="00FC0F1D"/>
-    <w:rsid w:val="00FC2572"/>
-    <w:rsid w:val="00FC29A3"/>
-    <w:rsid w:val="00FC4BC5"/>
-    <w:rsid w:val="00FD205D"/>
-    <w:rsid w:val="00FD21B7"/>
-    <w:rsid w:val="00FD31D1"/>
-    <w:rsid w:val="00FD6D93"/>
-    <w:rsid w:val="00FE1825"/>
-    <w:rsid w:val="00FE34B1"/>
-    <w:rsid w:val="00FE40D5"/>
-    <w:rsid w:val="00FE75F4"/>
-    <w:rsid w:val="00FE7771"/>
-    <w:rsid w:val="00FF7081"/>
-  </w:rsids>
-  <m:mathPr>
-    <m:mathFont m:val="Cambria Math"/>
-    <m:brkBin m:val="before"/>
-    <m:brkBinSub m:val="--"/>
-    <m:smallFrac m:val="0"/>
-    <m:dispDef/>
-    <m:lMargin m:val="0"/>
-    <m:rMargin m:val="0"/>
-    <m:defJc m:val="centerGroup"/>
-    <m:wrapIndent m:val="1440"/>
-    <m:intLim m:val="subSup"/>
-    <m:naryLim m:val="undOvr"/>
-  </m:mathPr>
-  <w:themeFontLang w:val="en-US" w:eastAsia="zh-CN"/>
-  <w:clrSchemeMapping w:bg1="light1" w:t1="dark1" w:bg2="light2" w:t2="dark2" w:accent1="accent1" w:accent2="accent2" w:accent3="accent3" w:accent4="accent4" w:accent5="accent5" w:accent6="accent6" w:hyperlink="hyperlink" w:followedHyperlink="followedHyperlink"/>
-  <w:doNotIncludeSubdocsInStats/>
-  <w:shapeDefaults>
-    <o:shapedefaults v:ext="edit" spidmax="2050"/>
-    <o:shapelayout v:ext="edit">
-      <o:idmap v:ext="edit" data="2"/>
-    </o:shapelayout>
-  </w:shapeDefaults>
-  <w:decimalSymbol w:val="."/>
-  <w:listSeparator w:val=","/>
-  <w14:docId w14:val="1BB9D2CB"/>
-  <w15:chartTrackingRefBased/>
-  <w15:docId w15:val="{5CF2BD7B-A74C-4690-95F1-758515B13410}"/>
-</w:settings>
-</file>
-
-<file path=word\styles.xml><?xml version="1.0" encoding="utf-8"?>
+<file path=word/styles.xml><?xml version="1.0" encoding="utf-8"?>
 <w:styles xmlns:mc="http://schemas.openxmlformats.org/markup-compatibility/2006" xmlns:r="http://schemas.openxmlformats.org/officeDocument/2006/relationships" xmlns:w="http://schemas.openxmlformats.org/wordprocessingml/2006/main" xmlns:w14="http://schemas.microsoft.com/office/word/2010/wordml" xmlns:w15="http://schemas.microsoft.com/office/word/2012/wordml" xmlns:w16cex="http://schemas.microsoft.com/office/word/2018/wordml/cex" xmlns:w16cid="http://schemas.microsoft.com/office/word/2016/wordml/cid" xmlns:w16="http://schemas.microsoft.com/office/word/2018/wordml" xmlns:w16du="http://schemas.microsoft.com/office/word/2023/wordml/word16du" xmlns:w16sdtdh="http://schemas.microsoft.com/office/word/2020/wordml/sdtdatahash" xmlns:w16sdtfl="http://schemas.microsoft.com/office/word/2024/wordml/sdtformatlock" xmlns:w16se="http://schemas.microsoft.com/office/word/2015/wordml/symex" mc:Ignorable="w14 w15 w16se w16cid w16 w16cex w16sdtdh w16sdtfl w16du">
   <w:docDefaults>
     <w:rPrDefault>
@@ -10200,7 +9158,7 @@
 </w:styles>
 </file>
 
-<file path=word\theme\theme1.xml><?xml version="1.0" encoding="utf-8"?>
+<file path=word/theme/theme1.xml><?xml version="1.0" encoding="utf-8"?>
 <a:theme xmlns:a="http://schemas.openxmlformats.org/drawingml/2006/main" name="Office Theme">
   <a:themeElements>
     <a:clrScheme name="Office">
@@ -10495,347 +9453,14 @@
 </a:theme>
 </file>
 
-<file path=word\webSettings.xml><?xml version="1.0" encoding="utf-8"?>
-<w:webSettings xmlns:mc="http://schemas.openxmlformats.org/markup-compatibility/2006" xmlns:r="http://schemas.openxmlformats.org/officeDocument/2006/relationships" xmlns:w="http://schemas.openxmlformats.org/wordprocessingml/2006/main" xmlns:w14="http://schemas.microsoft.com/office/word/2010/wordml" xmlns:w15="http://schemas.microsoft.com/office/word/2012/wordml" xmlns:w16cex="http://schemas.microsoft.com/office/word/2018/wordml/cex" xmlns:w16cid="http://schemas.microsoft.com/office/word/2016/wordml/cid" xmlns:w16="http://schemas.microsoft.com/office/word/2018/wordml" xmlns:w16du="http://schemas.microsoft.com/office/word/2023/wordml/word16du" xmlns:w16sdtdh="http://schemas.microsoft.com/office/word/2020/wordml/sdtdatahash" xmlns:w16sdtfl="http://schemas.microsoft.com/office/word/2024/wordml/sdtformatlock" xmlns:w16se="http://schemas.microsoft.com/office/word/2015/wordml/symex" mc:Ignorable="w14 w15 w16se w16cid w16 w16cex w16sdtdh w16sdtfl w16du">
-  <w:divs>
-    <w:div w:id="29189774">
-      <w:bodyDiv w:val="1"/>
-      <w:marLeft w:val="0"/>
-      <w:marRight w:val="0"/>
-      <w:marTop w:val="0"/>
-      <w:marBottom w:val="0"/>
-      <w:divBdr>
-        <w:top w:val="none" w:sz="0" w:space="0" w:color="auto"/>
-        <w:left w:val="none" w:sz="0" w:space="0" w:color="auto"/>
-        <w:bottom w:val="none" w:sz="0" w:space="0" w:color="auto"/>
-        <w:right w:val="none" w:sz="0" w:space="0" w:color="auto"/>
-      </w:divBdr>
-    </w:div>
-    <w:div w:id="619454370">
-      <w:bodyDiv w:val="1"/>
-      <w:marLeft w:val="0"/>
-      <w:marRight w:val="0"/>
-      <w:marTop w:val="0"/>
-      <w:marBottom w:val="0"/>
-      <w:divBdr>
-        <w:top w:val="none" w:sz="0" w:space="0" w:color="auto"/>
-        <w:left w:val="none" w:sz="0" w:space="0" w:color="auto"/>
-        <w:bottom w:val="none" w:sz="0" w:space="0" w:color="auto"/>
-        <w:right w:val="none" w:sz="0" w:space="0" w:color="auto"/>
-      </w:divBdr>
-    </w:div>
-    <w:div w:id="1076249428">
-      <w:bodyDiv w:val="1"/>
-      <w:marLeft w:val="0"/>
-      <w:marRight w:val="0"/>
-      <w:marTop w:val="0"/>
-      <w:marBottom w:val="0"/>
-      <w:divBdr>
-        <w:top w:val="none" w:sz="0" w:space="0" w:color="auto"/>
-        <w:left w:val="none" w:sz="0" w:space="0" w:color="auto"/>
-        <w:bottom w:val="none" w:sz="0" w:space="0" w:color="auto"/>
-        <w:right w:val="none" w:sz="0" w:space="0" w:color="auto"/>
-      </w:divBdr>
-    </w:div>
-    <w:div w:id="1466242249">
-      <w:bodyDiv w:val="1"/>
-      <w:marLeft w:val="0"/>
-      <w:marRight w:val="0"/>
-      <w:marTop w:val="0"/>
-      <w:marBottom w:val="0"/>
-      <w:divBdr>
-        <w:top w:val="none" w:sz="0" w:space="0" w:color="auto"/>
-        <w:left w:val="none" w:sz="0" w:space="0" w:color="auto"/>
-        <w:bottom w:val="none" w:sz="0" w:space="0" w:color="auto"/>
-        <w:right w:val="none" w:sz="0" w:space="0" w:color="auto"/>
-      </w:divBdr>
-      <w:divsChild>
-        <w:div w:id="124662048">
-          <w:marLeft w:val="0"/>
-          <w:marRight w:val="0"/>
-          <w:marTop w:val="0"/>
-          <w:marBottom w:val="0"/>
-          <w:divBdr>
-            <w:top w:val="none" w:sz="0" w:space="0" w:color="auto"/>
-            <w:left w:val="none" w:sz="0" w:space="0" w:color="auto"/>
-            <w:bottom w:val="none" w:sz="0" w:space="0" w:color="auto"/>
-            <w:right w:val="none" w:sz="0" w:space="0" w:color="auto"/>
-          </w:divBdr>
-        </w:div>
-        <w:div w:id="251936057">
-          <w:marLeft w:val="0"/>
-          <w:marRight w:val="0"/>
-          <w:marTop w:val="0"/>
-          <w:marBottom w:val="0"/>
-          <w:divBdr>
-            <w:top w:val="none" w:sz="0" w:space="0" w:color="auto"/>
-            <w:left w:val="none" w:sz="0" w:space="0" w:color="auto"/>
-            <w:bottom w:val="none" w:sz="0" w:space="0" w:color="auto"/>
-            <w:right w:val="none" w:sz="0" w:space="0" w:color="auto"/>
-          </w:divBdr>
-        </w:div>
-        <w:div w:id="341468419">
-          <w:marLeft w:val="0"/>
-          <w:marRight w:val="0"/>
-          <w:marTop w:val="0"/>
-          <w:marBottom w:val="0"/>
-          <w:divBdr>
-            <w:top w:val="none" w:sz="0" w:space="0" w:color="auto"/>
-            <w:left w:val="none" w:sz="0" w:space="0" w:color="auto"/>
-            <w:bottom w:val="none" w:sz="0" w:space="0" w:color="auto"/>
-            <w:right w:val="none" w:sz="0" w:space="0" w:color="auto"/>
-          </w:divBdr>
-        </w:div>
-        <w:div w:id="1018897608">
-          <w:marLeft w:val="0"/>
-          <w:marRight w:val="0"/>
-          <w:marTop w:val="0"/>
-          <w:marBottom w:val="0"/>
-          <w:divBdr>
-            <w:top w:val="none" w:sz="0" w:space="0" w:color="auto"/>
-            <w:left w:val="none" w:sz="0" w:space="0" w:color="auto"/>
-            <w:bottom w:val="none" w:sz="0" w:space="0" w:color="auto"/>
-            <w:right w:val="none" w:sz="0" w:space="0" w:color="auto"/>
-          </w:divBdr>
-        </w:div>
-        <w:div w:id="1095173854">
-          <w:marLeft w:val="0"/>
-          <w:marRight w:val="0"/>
-          <w:marTop w:val="0"/>
-          <w:marBottom w:val="0"/>
-          <w:divBdr>
-            <w:top w:val="none" w:sz="0" w:space="0" w:color="auto"/>
-            <w:left w:val="none" w:sz="0" w:space="0" w:color="auto"/>
-            <w:bottom w:val="none" w:sz="0" w:space="0" w:color="auto"/>
-            <w:right w:val="none" w:sz="0" w:space="0" w:color="auto"/>
-          </w:divBdr>
-        </w:div>
-        <w:div w:id="1382827652">
-          <w:marLeft w:val="0"/>
-          <w:marRight w:val="0"/>
-          <w:marTop w:val="0"/>
-          <w:marBottom w:val="0"/>
-          <w:divBdr>
-            <w:top w:val="none" w:sz="0" w:space="0" w:color="auto"/>
-            <w:left w:val="none" w:sz="0" w:space="0" w:color="auto"/>
-            <w:bottom w:val="none" w:sz="0" w:space="0" w:color="auto"/>
-            <w:right w:val="none" w:sz="0" w:space="0" w:color="auto"/>
-          </w:divBdr>
-        </w:div>
-      </w:divsChild>
-    </w:div>
-    <w:div w:id="1595556810">
-      <w:bodyDiv w:val="1"/>
-      <w:marLeft w:val="0"/>
-      <w:marRight w:val="0"/>
-      <w:marTop w:val="0"/>
-      <w:marBottom w:val="0"/>
-      <w:divBdr>
-        <w:top w:val="none" w:sz="0" w:space="0" w:color="auto"/>
-        <w:left w:val="none" w:sz="0" w:space="0" w:color="auto"/>
-        <w:bottom w:val="none" w:sz="0" w:space="0" w:color="auto"/>
-        <w:right w:val="none" w:sz="0" w:space="0" w:color="auto"/>
-      </w:divBdr>
-    </w:div>
-    <w:div w:id="1773817687">
-      <w:bodyDiv w:val="1"/>
-      <w:marLeft w:val="0"/>
-      <w:marRight w:val="0"/>
-      <w:marTop w:val="0"/>
-      <w:marBottom w:val="0"/>
-      <w:divBdr>
-        <w:top w:val="none" w:sz="0" w:space="0" w:color="auto"/>
-        <w:left w:val="none" w:sz="0" w:space="0" w:color="auto"/>
-        <w:bottom w:val="none" w:sz="0" w:space="0" w:color="auto"/>
-        <w:right w:val="none" w:sz="0" w:space="0" w:color="auto"/>
-      </w:divBdr>
-    </w:div>
-    <w:div w:id="1885947973">
-      <w:bodyDiv w:val="1"/>
-      <w:marLeft w:val="0"/>
-      <w:marRight w:val="0"/>
-      <w:marTop w:val="0"/>
-      <w:marBottom w:val="0"/>
-      <w:divBdr>
-        <w:top w:val="none" w:sz="0" w:space="0" w:color="auto"/>
-        <w:left w:val="none" w:sz="0" w:space="0" w:color="auto"/>
-        <w:bottom w:val="none" w:sz="0" w:space="0" w:color="auto"/>
-        <w:right w:val="none" w:sz="0" w:space="0" w:color="auto"/>
-      </w:divBdr>
-      <w:divsChild>
-        <w:div w:id="569003461">
-          <w:marLeft w:val="0"/>
-          <w:marRight w:val="0"/>
-          <w:marTop w:val="0"/>
-          <w:marBottom w:val="0"/>
-          <w:divBdr>
-            <w:top w:val="none" w:sz="0" w:space="0" w:color="auto"/>
-            <w:left w:val="none" w:sz="0" w:space="0" w:color="auto"/>
-            <w:bottom w:val="none" w:sz="0" w:space="0" w:color="auto"/>
-            <w:right w:val="none" w:sz="0" w:space="0" w:color="auto"/>
-          </w:divBdr>
-          <w:divsChild>
-            <w:div w:id="528950263">
-              <w:marLeft w:val="300"/>
-              <w:marRight w:val="0"/>
-              <w:marTop w:val="0"/>
-              <w:marBottom w:val="0"/>
-              <w:divBdr>
-                <w:top w:val="none" w:sz="0" w:space="0" w:color="auto"/>
-                <w:left w:val="none" w:sz="0" w:space="0" w:color="auto"/>
-                <w:bottom w:val="none" w:sz="0" w:space="0" w:color="auto"/>
-                <w:right w:val="none" w:sz="0" w:space="0" w:color="auto"/>
-              </w:divBdr>
-            </w:div>
-            <w:div w:id="966155954">
-              <w:marLeft w:val="0"/>
-              <w:marRight w:val="0"/>
-              <w:marTop w:val="0"/>
-              <w:marBottom w:val="0"/>
-              <w:divBdr>
-                <w:top w:val="none" w:sz="0" w:space="0" w:color="auto"/>
-                <w:left w:val="none" w:sz="0" w:space="0" w:color="auto"/>
-                <w:bottom w:val="none" w:sz="0" w:space="0" w:color="auto"/>
-                <w:right w:val="none" w:sz="0" w:space="0" w:color="auto"/>
-              </w:divBdr>
-            </w:div>
-            <w:div w:id="1389458006">
-              <w:marLeft w:val="60"/>
-              <w:marRight w:val="0"/>
-              <w:marTop w:val="0"/>
-              <w:marBottom w:val="0"/>
-              <w:divBdr>
-                <w:top w:val="none" w:sz="0" w:space="0" w:color="auto"/>
-                <w:left w:val="none" w:sz="0" w:space="0" w:color="auto"/>
-                <w:bottom w:val="none" w:sz="0" w:space="0" w:color="auto"/>
-                <w:right w:val="none" w:sz="0" w:space="0" w:color="auto"/>
-              </w:divBdr>
-            </w:div>
-            <w:div w:id="1513492126">
-              <w:marLeft w:val="0"/>
-              <w:marRight w:val="0"/>
-              <w:marTop w:val="0"/>
-              <w:marBottom w:val="0"/>
-              <w:divBdr>
-                <w:top w:val="none" w:sz="0" w:space="0" w:color="auto"/>
-                <w:left w:val="none" w:sz="0" w:space="0" w:color="auto"/>
-                <w:bottom w:val="none" w:sz="0" w:space="0" w:color="auto"/>
-                <w:right w:val="none" w:sz="0" w:space="0" w:color="auto"/>
-              </w:divBdr>
-            </w:div>
-            <w:div w:id="1962032283">
-              <w:marLeft w:val="300"/>
-              <w:marRight w:val="0"/>
-              <w:marTop w:val="0"/>
-              <w:marBottom w:val="0"/>
-              <w:divBdr>
-                <w:top w:val="none" w:sz="0" w:space="0" w:color="auto"/>
-                <w:left w:val="none" w:sz="0" w:space="0" w:color="auto"/>
-                <w:bottom w:val="none" w:sz="0" w:space="0" w:color="auto"/>
-                <w:right w:val="none" w:sz="0" w:space="0" w:color="auto"/>
-              </w:divBdr>
-            </w:div>
-          </w:divsChild>
-        </w:div>
-        <w:div w:id="1898978649">
-          <w:marLeft w:val="0"/>
-          <w:marRight w:val="0"/>
-          <w:marTop w:val="0"/>
-          <w:marBottom w:val="0"/>
-          <w:divBdr>
-            <w:top w:val="none" w:sz="0" w:space="0" w:color="auto"/>
-            <w:left w:val="none" w:sz="0" w:space="0" w:color="auto"/>
-            <w:bottom w:val="none" w:sz="0" w:space="0" w:color="auto"/>
-            <w:right w:val="none" w:sz="0" w:space="0" w:color="auto"/>
-          </w:divBdr>
-          <w:divsChild>
-            <w:div w:id="1389114041">
-              <w:marLeft w:val="0"/>
-              <w:marRight w:val="0"/>
-              <w:marTop w:val="120"/>
-              <w:marBottom w:val="0"/>
-              <w:divBdr>
-                <w:top w:val="none" w:sz="0" w:space="0" w:color="auto"/>
-                <w:left w:val="none" w:sz="0" w:space="0" w:color="auto"/>
-                <w:bottom w:val="none" w:sz="0" w:space="0" w:color="auto"/>
-                <w:right w:val="none" w:sz="0" w:space="0" w:color="auto"/>
-              </w:divBdr>
-              <w:divsChild>
-                <w:div w:id="1788936371">
-                  <w:marLeft w:val="0"/>
-                  <w:marRight w:val="0"/>
-                  <w:marTop w:val="0"/>
-                  <w:marBottom w:val="0"/>
-                  <w:divBdr>
-                    <w:top w:val="none" w:sz="0" w:space="0" w:color="auto"/>
-                    <w:left w:val="none" w:sz="0" w:space="0" w:color="auto"/>
-                    <w:bottom w:val="none" w:sz="0" w:space="0" w:color="auto"/>
-                    <w:right w:val="none" w:sz="0" w:space="0" w:color="auto"/>
-                  </w:divBdr>
-                  <w:divsChild>
-                    <w:div w:id="932056568">
-                      <w:marLeft w:val="0"/>
-                      <w:marRight w:val="0"/>
-                      <w:marTop w:val="0"/>
-                      <w:marBottom w:val="0"/>
-                      <w:divBdr>
-                        <w:top w:val="none" w:sz="0" w:space="0" w:color="auto"/>
-                        <w:left w:val="none" w:sz="0" w:space="0" w:color="auto"/>
-                        <w:bottom w:val="none" w:sz="0" w:space="0" w:color="auto"/>
-                        <w:right w:val="none" w:sz="0" w:space="0" w:color="auto"/>
-                      </w:divBdr>
-                      <w:divsChild>
-                        <w:div w:id="1746107275">
-                          <w:marLeft w:val="0"/>
-                          <w:marRight w:val="0"/>
-                          <w:marTop w:val="0"/>
-                          <w:marBottom w:val="0"/>
-                          <w:divBdr>
-                            <w:top w:val="none" w:sz="0" w:space="0" w:color="auto"/>
-                            <w:left w:val="none" w:sz="0" w:space="0" w:color="auto"/>
-                            <w:bottom w:val="none" w:sz="0" w:space="0" w:color="auto"/>
-                            <w:right w:val="none" w:sz="0" w:space="0" w:color="auto"/>
-                          </w:divBdr>
-                        </w:div>
-                      </w:divsChild>
-                    </w:div>
-                  </w:divsChild>
-                </w:div>
-              </w:divsChild>
-            </w:div>
-          </w:divsChild>
-        </w:div>
-      </w:divsChild>
-    </w:div>
-    <w:div w:id="2043968573">
-      <w:bodyDiv w:val="1"/>
-      <w:marLeft w:val="0"/>
-      <w:marRight w:val="0"/>
-      <w:marTop w:val="0"/>
-      <w:marBottom w:val="0"/>
-      <w:divBdr>
-        <w:top w:val="none" w:sz="0" w:space="0" w:color="auto"/>
-        <w:left w:val="none" w:sz="0" w:space="0" w:color="auto"/>
-        <w:bottom w:val="none" w:sz="0" w:space="0" w:color="auto"/>
-        <w:right w:val="none" w:sz="0" w:space="0" w:color="auto"/>
-      </w:divBdr>
-    </w:div>
-    <w:div w:id="2123302183">
-      <w:bodyDiv w:val="1"/>
-      <w:marLeft w:val="0"/>
-      <w:marRight w:val="0"/>
-      <w:marTop w:val="0"/>
-      <w:marBottom w:val="0"/>
-      <w:divBdr>
-        <w:top w:val="none" w:sz="0" w:space="0" w:color="auto"/>
-        <w:left w:val="none" w:sz="0" w:space="0" w:color="auto"/>
-        <w:bottom w:val="none" w:sz="0" w:space="0" w:color="auto"/>
-        <w:right w:val="none" w:sz="0" w:space="0" w:color="auto"/>
-      </w:divBdr>
-    </w:div>
-  </w:divs>
-  <w:optimizeForBrowser/>
-  <w:relyOnVML/>
-  <w:allowPNG/>
-</w:webSettings>
+<file path=customXml/item1.xml><?xml version="1.0" encoding="utf-8"?>
+<b:Sources xmlns:b="http://schemas.openxmlformats.org/officeDocument/2006/bibliography" xmlns="http://schemas.openxmlformats.org/officeDocument/2006/bibliography" SelectedStyle="\APASixthEditionOfficeOnline.xsl" StyleName="APA" Version="6"/>
+</file>
+
+<file path=customXml/itemProps1.xml><?xml version="1.0" encoding="utf-8"?>
+<ds:datastoreItem xmlns:ds="http://schemas.openxmlformats.org/officeDocument/2006/customXml" ds:itemID="{840D81B6-2FB1-4541-A0EF-DBDDBF1D146C}">
+  <ds:schemaRefs>
+    <ds:schemaRef ds:uri="http://schemas.openxmlformats.org/officeDocument/2006/bibliography"/>
+  </ds:schemaRefs>
+</ds:datastoreItem>
 </file>
</xml_diff>

<commit_message>
CV: GIS Day at OSU 2026 student poster competition, third place ($50)
Co-Authored-By: Claude Opus 5.5 <noreply@anthropic.com>
</commit_message>
<xml_diff>
--- a/doc/Dingjin Chu_CV_Updating.docx
+++ b/doc/Dingjin Chu_CV_Updating.docx
@@ -1605,6 +1605,22 @@
         <w:t>2026 Afanasiev Distinguished Graduate Fellowship Award</w:t>
       </w:r>
       <w:bookmarkEnd w:id="2"/>
+    </w:p>
+    <w:p>
+      <w:pPr>
+        <w:spacing w:line="300" w:lineRule="auto"/>
+        <w:rPr>
+          <w:rFonts w:eastAsia="DengXian"/>
+          <w:lang w:eastAsia="zh-CN"/>
+        </w:rPr>
+      </w:pPr>
+      <w:r>
+        <w:rPr>
+          <w:rFonts w:eastAsia="DengXian"/>
+          <w:lang w:eastAsia="zh-CN"/>
+        </w:rPr>
+        <w:t xml:space="preserve">2026 Third Place ($50), Student Poster Competition, GIS Day at OSU, Oklahoma State University</w:t>
+      </w:r>
     </w:p>
     <w:p>
       <w:pPr>

</xml_diff>

<commit_message>
CV: add GIS Day at OSU 2026 poster under Conference Presentations
Co-Authored-By: Claude Opus 5.5 <noreply@anthropic.com>
</commit_message>
<xml_diff>
--- a/doc/Dingjin Chu_CV_Updating.docx
+++ b/doc/Dingjin Chu_CV_Updating.docx
@@ -1741,6 +1741,36 @@
           <w:lang w:eastAsia="zh-CN"/>
         </w:rPr>
         <w:t xml:space="preserve">2026 </w:t>
+      </w:r>
+    </w:p>
+    <w:p>
+      <w:pPr>
+        <w:spacing w:line="300" w:lineRule="auto"/>
+        <w:rPr>
+          <w:rFonts w:eastAsia="DengXian"/>
+        </w:rPr>
+      </w:pPr>
+      <w:r>
+        <w:rPr>
+          <w:rFonts w:eastAsia="DengXian"/>
+          <w:lang w:eastAsia="zh-CN"/>
+        </w:rPr>
+        <w:t xml:space="preserve">10/2026 - Chu, D, </w:t>
+      </w:r>
+      <w:r>
+        <w:rPr>
+          <w:rFonts w:eastAsia="DengXian"/>
+          <w:b/>
+          <w:bCs/>
+        </w:rPr>
+        <w:t xml:space="preserve">Local-scale bias in global products of forest aboveground biomass related to structural diversity, stand density, and forest age. Poster at GIS Day at OSU</w:t>
+      </w:r>
+      <w:r>
+        <w:rPr>
+          <w:rFonts w:eastAsia="DengXian"/>
+          <w:lang w:eastAsia="zh-CN"/>
+        </w:rPr>
+        <w:t xml:space="preserve">, October 20, 2026, Stillwater, Oklahoma (Third Place, Student Poster Competition).</w:t>
       </w:r>
     </w:p>
     <w:p>

</xml_diff>